<commit_message>
Fix generate excel column and update report_summary
</commit_message>
<xml_diff>
--- a/CoursePatterns/report_summary.docx
+++ b/CoursePatterns/report_summary.docx
@@ -32,13 +32,49 @@
         <w:rPr>
           <w:lang w:val="en-US"/>
         </w:rPr>
-        <w:t>most taken</w:t>
-      </w:r>
-      <w:r>
-        <w:rPr>
-          <w:lang w:val="en-US"/>
-        </w:rPr>
-        <w:t xml:space="preserve"> courses across all semesters and years are COSE213 (Data Structures), COSE214 (Algorithms), COSE341, COSE211 (Discrete Mathematics), COSE222, and COSE342. These courses show up in over 83–93% of students’ course histories, suggesting they’re core subjects in the CS curriculum. They’re also often taken together</w:t>
+        <w:t>courses most taken</w:t>
+      </w:r>
+      <w:r>
+        <w:rPr>
+          <w:lang w:val="en-US"/>
+        </w:rPr>
+        <w:t xml:space="preserve"> across all semesters and years are COSE213 (Data Structures), COSE214 (Algorithms), COSE341</w:t>
+      </w:r>
+      <w:r>
+        <w:rPr>
+          <w:lang w:val="en-US"/>
+        </w:rPr>
+        <w:t xml:space="preserve"> (Operating Systems)</w:t>
+      </w:r>
+      <w:r>
+        <w:rPr>
+          <w:lang w:val="en-US"/>
+        </w:rPr>
+        <w:t>, COSE211 (Discrete Mathematics), COSE222</w:t>
+      </w:r>
+      <w:r>
+        <w:rPr>
+          <w:lang w:val="en-US"/>
+        </w:rPr>
+        <w:t xml:space="preserve"> (Computer Architecture)</w:t>
+      </w:r>
+      <w:r>
+        <w:rPr>
+          <w:lang w:val="en-US"/>
+        </w:rPr>
+        <w:t>, and COSE342</w:t>
+      </w:r>
+      <w:r>
+        <w:rPr>
+          <w:lang w:val="en-US"/>
+        </w:rPr>
+        <w:t xml:space="preserve"> (Computer Network)</w:t>
+      </w:r>
+      <w:r>
+        <w:rPr>
+          <w:lang w:val="en-US"/>
+        </w:rPr>
+        <w:t>. These courses show up in over 83–93% of students’ course histories, suggesting they’re core subjects in the CS curriculum. They’re also often taken together</w:t>
       </w:r>
       <w:r>
         <w:rPr>
@@ -405,7 +441,61 @@
         <w:rPr>
           <w:lang w:val="en-US"/>
         </w:rPr>
-        <w:t>frequency, the most taken courses are COSE214, COSE341, COSE222, COSE211, and COSE342 (with 36–40 students each). The least taken ones include COSE407, COSE394, and COSE457—with only 1 student each.</w:t>
+        <w:t>frequency, the most taken courses are COSE214, COSE341, COSE222, COSE211, and COSE342 (with 36–40 students each). The least taken ones include COSE407</w:t>
+      </w:r>
+      <w:r>
+        <w:rPr>
+          <w:lang w:val="en-US"/>
+        </w:rPr>
+        <w:t xml:space="preserve"> (</w:t>
+      </w:r>
+      <w:r>
+        <w:rPr>
+          <w:lang w:val="en-US"/>
+        </w:rPr>
+        <w:t>Independent Study Project</w:t>
+      </w:r>
+      <w:r>
+        <w:rPr>
+          <w:lang w:val="en-US"/>
+        </w:rPr>
+        <w:t>)</w:t>
+      </w:r>
+      <w:r>
+        <w:rPr>
+          <w:lang w:val="en-US"/>
+        </w:rPr>
+        <w:t>, COSE394</w:t>
+      </w:r>
+      <w:r>
+        <w:rPr>
+          <w:lang w:val="en-US"/>
+        </w:rPr>
+        <w:t xml:space="preserve"> (Creative Software Startup Methodology)</w:t>
+      </w:r>
+      <w:r>
+        <w:rPr>
+          <w:lang w:val="en-US"/>
+        </w:rPr>
+        <w:t>, and COSE457</w:t>
+      </w:r>
+      <w:r>
+        <w:rPr>
+          <w:lang w:val="en-US"/>
+        </w:rPr>
+        <w:t xml:space="preserve"> </w:t>
+      </w:r>
+      <w:r>
+        <w:rPr>
+          <w:lang w:val="en-US"/>
+        </w:rPr>
+        <w:t xml:space="preserve">(Practice SW Project) </w:t>
+      </w:r>
+      <w:r>
+        <w:rPr>
+          <w:lang w:val="en-US"/>
+        </w:rPr>
+        <w:t>with only 1 student each.</w:t>
       </w:r>
     </w:p>
     <w:p>
@@ -418,7 +508,19 @@
         <w:rPr>
           <w:lang w:val="en-US"/>
         </w:rPr>
-        <w:t>This supports the idea that the most frequent courses are core or compulsory subjects. For instance:</w:t>
+        <w:t xml:space="preserve">This supports the idea that the most frequent courses are </w:t>
+      </w:r>
+      <w:r>
+        <w:rPr>
+          <w:lang w:val="en-US"/>
+        </w:rPr>
+        <w:t xml:space="preserve">mostly </w:t>
+      </w:r>
+      <w:r>
+        <w:rPr>
+          <w:lang w:val="en-US"/>
+        </w:rPr>
+        <w:t>core or compulsory subjects. For instance:</w:t>
       </w:r>
     </w:p>
     <w:p>
@@ -605,7 +707,43 @@
         <w:rPr>
           <w:lang w:val="en-US"/>
         </w:rPr>
-        <w:t xml:space="preserve">Finally, if we look at support values across years, Year 2 and 3 show high overlap in course-taking patterns—most students follow the same set of major courses. But in Year 4, support values </w:t>
+        <w:t xml:space="preserve">Finally, if we look at support values across years, Year 2 and 3 show </w:t>
+      </w:r>
+      <w:r>
+        <w:rPr>
+          <w:lang w:val="en-US"/>
+        </w:rPr>
+        <w:t xml:space="preserve">some </w:t>
+      </w:r>
+      <w:r>
+        <w:rPr>
+          <w:lang w:val="en-US"/>
+        </w:rPr>
+        <w:t>overlap in course</w:t>
+      </w:r>
+      <w:r>
+        <w:rPr>
+          <w:lang w:val="en-US"/>
+        </w:rPr>
+        <w:t xml:space="preserve"> </w:t>
+      </w:r>
+      <w:r>
+        <w:rPr>
+          <w:lang w:val="en-US"/>
+        </w:rPr>
+        <w:t>taking patterns</w:t>
+      </w:r>
+      <w:r>
+        <w:rPr>
+          <w:lang w:val="en-US"/>
+        </w:rPr>
+        <w:t>. M</w:t>
+      </w:r>
+      <w:r>
+        <w:rPr>
+          <w:lang w:val="en-US"/>
+        </w:rPr>
+        <w:t xml:space="preserve">ost students follow the same set of major courses. But in Year 4, support values </w:t>
       </w:r>
       <w:r>
         <w:rPr>
@@ -617,7 +755,31 @@
         <w:rPr>
           <w:lang w:val="en-US"/>
         </w:rPr>
-        <w:t xml:space="preserve"> significantly. This means course selection becomes more diverse, probably due to students picking different electives or minor courses based on their interests or graduation plans.</w:t>
+        <w:t xml:space="preserve"> significantly. This </w:t>
+      </w:r>
+      <w:r>
+        <w:rPr>
+          <w:lang w:val="en-US"/>
+        </w:rPr>
+        <w:t xml:space="preserve">possibly </w:t>
+      </w:r>
+      <w:r>
+        <w:rPr>
+          <w:lang w:val="en-US"/>
+        </w:rPr>
+        <w:t xml:space="preserve">means </w:t>
+      </w:r>
+      <w:r>
+        <w:rPr>
+          <w:lang w:val="en-US"/>
+        </w:rPr>
+        <w:t xml:space="preserve">that </w:t>
+      </w:r>
+      <w:r>
+        <w:rPr>
+          <w:lang w:val="en-US"/>
+        </w:rPr>
+        <w:t>course selection becomes more diverse, probably due to students picking different electives or minor courses based on their interests or graduation plans.</w:t>
       </w:r>
     </w:p>
     <w:sectPr>
@@ -2910,6 +3072,7 @@
   <w:style w:type="character" w:default="1" w:styleId="DefaultParagraphFont">
     <w:name w:val="Default Paragraph Font"/>
     <w:uiPriority w:val="1"/>
+    <w:semiHidden/>
     <w:unhideWhenUsed/>
   </w:style>
   <w:style w:type="table" w:default="1" w:styleId="TableNormal">

</xml_diff>